<commit_message>
Opdater kravspec v0.5 med GitHub-link til aarsarkiv-skabelon
</commit_message>
<xml_diff>
--- a/olsenklanen_kravspecifikation_v05.docx
+++ b/olsenklanen_kravspecifikation_v05.docx
@@ -4125,6 +4125,26 @@
       <w:pPr>
         <w:pStyle w:val="Overskrift3"/>
       </w:pPr>
+      <w:r>
+        <w:t>GitHub-link til skabelonen</w:t>
+      </w:r>
+    </w:p>
+    <w:p>
+      <w:r>
+        <w:t>Skabelonfilen kan tilgås og downloades direkte fra projektets GitHub-repositorium:</w:t>
+      </w:r>
+    </w:p>
+    <w:p>
+      <w:r>
+        <w:t>https://github.com/carstengramsth-beep/OlsenKlanen/blob/main/aarsarkiv_skabelon.html</w:t>
+      </w:r>
+    </w:p>
+    <w:p>
+      <w:r>
+        <w:t>Rå fil (klar til download): https://raw.githubusercontent.com/carstengramsth-beep/OlsenKlanen/main/aarsarkiv_skabelon.html</w:t>
+      </w:r>
+    </w:p>
+    <w:p>
       <w:r>
         <w:t>Redaktørrolle ved nye årsarkiv-sider</w:t>
       </w:r>

</xml_diff>